<commit_message>
Complete school attendance assignment deliverables
</commit_message>
<xml_diff>
--- a/School_Attendance_System_Pseudocode.docx
+++ b/School_Attendance_System_Pseudocode.docx
@@ -8,11 +8,12 @@
       </w:pPr>
       <w:r>
         <w:rPr>
-          <w:rFonts w:ascii="Tahoma" w:hAnsi="Tahoma"/>
           <w:b/>
-          <w:sz w:val="32"/>
+          <w:sz w:val="36"/>
         </w:rPr>
         <w:t>SCHOOL ATTENDANCE SYSTEM</w:t>
+        <w:br/>
+        <w:t>PSEUDOCODE</w:t>
       </w:r>
     </w:p>
     <w:p>
@@ -20,26 +21,10 @@
         <w:jc w:val="center"/>
       </w:pPr>
       <w:r>
-        <w:rPr>
-          <w:rFonts w:ascii="Tahoma" w:hAnsi="Tahoma"/>
-          <w:b/>
-          <w:sz w:val="28"/>
-        </w:rPr>
-        <w:t>PSEUDOCODE</w:t>
-      </w:r>
-    </w:p>
-    <w:p>
-      <w:r>
         <w:t>Student Name: Sulaiman Kondeh</w:t>
-      </w:r>
-    </w:p>
-    <w:p>
-      <w:r>
+        <w:br/>
         <w:t>Course: Programming Logic Assignment</w:t>
-      </w:r>
-    </w:p>
-    <w:p>
-      <w:r>
+        <w:br/>
         <w:t>Project: Electronic School Attendance System</w:t>
       </w:r>
     </w:p>
@@ -53,7 +38,7 @@
     </w:p>
     <w:p>
       <w:r>
-        <w:t>This pseudocode describes the basic logic of a proposed electronic attendance system for a secondary school. It allows an authorised teacher to select a class, record each student's attendance as Present, Absent, or Late, save the records, and generate an attendance summary.</w:t>
+        <w:t>This pseudocode describes the core logic of a school attendance prototype. It accepts a class, date, and student count; records each student as Present, Absent, or Late; checks inputs; and displays a summary. The Flowgorithm prototype demonstrates this process but does not store records in a database.</w:t>
       </w:r>
     </w:p>
     <w:p>
@@ -65,118 +50,86 @@
       </w:r>
     </w:p>
     <w:p>
-      <w:pPr>
-        <w:ind w:left="360" w:right="144"/>
-      </w:pPr>
       <w:r>
         <w:rPr>
-          <w:rFonts w:ascii="Consolas" w:hAnsi="Consolas" w:eastAsia="Consolas"/>
+          <w:rFonts w:ascii="Courier New" w:hAnsi="Courier New"/>
           <w:sz w:val="18"/>
         </w:rPr>
         <w:t>BEGIN</w:t>
         <w:br/>
-        <w:br/>
-        <w:t xml:space="preserve">    DISPLAY "School Attendance System"</w:t>
+        <w:t xml:space="preserve">    DISPLAY "SCHOOL ATTENDANCE SYSTEM"</w:t>
         <w:br/>
         <w:br/>
-        <w:t xml:space="preserve">    INPUT teacher_username</w:t>
+        <w:t xml:space="preserve">    INPUT class_name</w:t>
         <w:br/>
-        <w:t xml:space="preserve">    INPUT teacher_password</w:t>
+        <w:t xml:space="preserve">    INPUT attendance_date</w:t>
         <w:br/>
         <w:br/>
-        <w:t xml:space="preserve">    IF login_details_are_valid THEN</w:t>
+        <w:t xml:space="preserve">    REPEAT</w:t>
         <w:br/>
-        <w:t xml:space="preserve">        DISPLAY "Login successful"</w:t>
+        <w:t xml:space="preserve">        DISPLAY "Enter number of students (greater than 0):"</w:t>
+        <w:br/>
+        <w:t xml:space="preserve">        INPUT student_count</w:t>
+        <w:br/>
+        <w:t xml:space="preserve">    UNTIL student_count &gt; 0</w:t>
         <w:br/>
         <w:br/>
-        <w:t xml:space="preserve">        INPUT class_name</w:t>
+        <w:t xml:space="preserve">    SET present_count = 0</w:t>
         <w:br/>
-        <w:t xml:space="preserve">        INPUT attendance_date</w:t>
+        <w:t xml:space="preserve">    SET absent_count = 0</w:t>
+        <w:br/>
+        <w:t xml:space="preserve">    SET late_count = 0</w:t>
+        <w:br/>
+        <w:t xml:space="preserve">    SET student_number = 1</w:t>
         <w:br/>
         <w:br/>
-        <w:t xml:space="preserve">        SET more_students = "YES"</w:t>
+        <w:t xml:space="preserve">    WHILE student_number &lt;= student_count DO</w:t>
+        <w:br/>
+        <w:t xml:space="preserve">        INPUT student_name</w:t>
         <w:br/>
         <w:br/>
-        <w:t xml:space="preserve">        WHILE more_students = "YES" DO</w:t>
+        <w:t xml:space="preserve">        REPEAT</w:t>
         <w:br/>
-        <w:t xml:space="preserve">            INPUT student_id</w:t>
+        <w:t xml:space="preserve">            DISPLAY "Enter P = Present, A = Absent, or L = Late:"</w:t>
         <w:br/>
-        <w:t xml:space="preserve">            INPUT student_name</w:t>
+        <w:t xml:space="preserve">            INPUT status_code</w:t>
+        <w:br/>
+        <w:t xml:space="preserve">        UNTIL status_code = "P" OR status_code = "A" OR status_code = "L"</w:t>
         <w:br/>
         <w:br/>
-        <w:t xml:space="preserve">            DISPLAY "Choose attendance status:"</w:t>
+        <w:t xml:space="preserve">        IF status_code = "P" THEN</w:t>
         <w:br/>
-        <w:t xml:space="preserve">            DISPLAY "P = Present"</w:t>
+        <w:t xml:space="preserve">            SET present_count = present_count + 1</w:t>
         <w:br/>
-        <w:t xml:space="preserve">            DISPLAY "A = Absent"</w:t>
+        <w:t xml:space="preserve">        ELSE IF status_code = "A" THEN</w:t>
         <w:br/>
-        <w:t xml:space="preserve">            DISPLAY "L = Late"</w:t>
+        <w:t xml:space="preserve">            SET absent_count = absent_count + 1</w:t>
         <w:br/>
-        <w:t xml:space="preserve">            INPUT attendance_status</w:t>
+        <w:t xml:space="preserve">        ELSE</w:t>
         <w:br/>
-        <w:br/>
-        <w:t xml:space="preserve">            IF attendance_status = "P" THEN</w:t>
-        <w:br/>
-        <w:t xml:space="preserve">                SET attendance_status = "Present"</w:t>
-        <w:br/>
-        <w:t xml:space="preserve">            ELSE IF attendance_status = "A" THEN</w:t>
-        <w:br/>
-        <w:t xml:space="preserve">                SET attendance_status = "Absent"</w:t>
-        <w:br/>
-        <w:t xml:space="preserve">            ELSE IF attendance_status = "L" THEN</w:t>
-        <w:br/>
-        <w:t xml:space="preserve">                SET attendance_status = "Late"</w:t>
-        <w:br/>
-        <w:t xml:space="preserve">            ELSE</w:t>
-        <w:br/>
-        <w:t xml:space="preserve">                DISPLAY "Invalid status. Enter P, A, or L."</w:t>
-        <w:br/>
-        <w:t xml:space="preserve">                INPUT attendance_status</w:t>
-        <w:br/>
-        <w:t xml:space="preserve">            END IF</w:t>
-        <w:br/>
-        <w:br/>
-        <w:t xml:space="preserve">            SAVE student_id, student_name, class_name,</w:t>
-        <w:br/>
-        <w:t xml:space="preserve">                 attendance_date, attendance_status</w:t>
-        <w:br/>
-        <w:br/>
-        <w:t xml:space="preserve">            DISPLAY "Attendance record saved"</w:t>
-        <w:br/>
-        <w:br/>
-        <w:t xml:space="preserve">            DISPLAY "Are there more students? (YES/NO)"</w:t>
-        <w:br/>
-        <w:t xml:space="preserve">            INPUT more_students</w:t>
-        <w:br/>
-        <w:t xml:space="preserve">        END WHILE</w:t>
-        <w:br/>
-        <w:br/>
-        <w:t xml:space="preserve">        DISPLAY "Do you want an attendance report? (YES/NO)"</w:t>
-        <w:br/>
-        <w:t xml:space="preserve">        INPUT report_choice</w:t>
-        <w:br/>
-        <w:br/>
-        <w:t xml:space="preserve">        IF report_choice = "YES" THEN</w:t>
-        <w:br/>
-        <w:t xml:space="preserve">            CALCULATE total_present</w:t>
-        <w:br/>
-        <w:t xml:space="preserve">            CALCULATE total_absent</w:t>
-        <w:br/>
-        <w:t xml:space="preserve">            CALCULATE total_late</w:t>
-        <w:br/>
-        <w:t xml:space="preserve">            DISPLAY attendance summary</w:t>
+        <w:t xml:space="preserve">            SET late_count = late_count + 1</w:t>
         <w:br/>
         <w:t xml:space="preserve">        END IF</w:t>
         <w:br/>
         <w:br/>
-        <w:t xml:space="preserve">        DISPLAY "Attendance process completed"</w:t>
+        <w:t xml:space="preserve">        SET student_number = student_number + 1</w:t>
         <w:br/>
-        <w:t xml:space="preserve">    ELSE</w:t>
+        <w:t xml:space="preserve">    END WHILE</w:t>
         <w:br/>
-        <w:t xml:space="preserve">        DISPLAY "Invalid login. Access denied."</w:t>
         <w:br/>
-        <w:t xml:space="preserve">    END IF</w:t>
+        <w:t xml:space="preserve">    DISPLAY "Class: ", class_name</w:t>
         <w:br/>
+        <w:t xml:space="preserve">    DISPLAY "Date: ", attendance_date</w:t>
+        <w:br/>
+        <w:t xml:space="preserve">    DISPLAY "Total students: ", student_count</w:t>
+        <w:br/>
+        <w:t xml:space="preserve">    DISPLAY "Present: ", present_count</w:t>
+        <w:br/>
+        <w:t xml:space="preserve">    DISPLAY "Absent: ", absent_count</w:t>
+        <w:br/>
+        <w:t xml:space="preserve">    DISPLAY "Late: ", late_count</w:t>
+        <w:br/>
+        <w:t xml:space="preserve">    DISPLAY "This prototype does not save records to a database."</w:t>
         <w:br/>
         <w:t>END</w:t>
       </w:r>
@@ -186,13 +139,10 @@
         <w:pStyle w:val="Heading1"/>
       </w:pPr>
       <w:r>
-        <w:t>3. Explanation of the Logic</w:t>
+        <w:t>3. Explanation of the logic</w:t>
       </w:r>
     </w:p>
     <w:p>
-      <w:pPr>
-        <w:pStyle w:val="ListBullet"/>
-      </w:pPr>
       <w:r>
         <w:rPr>
           <w:b/>
@@ -200,69 +150,43 @@
         <w:t xml:space="preserve">Sequence: </w:t>
       </w:r>
       <w:r>
-        <w:t>The steps are carried out in order: login, select class and date, record attendance, save records, and optionally generate a report.</w:t>
+        <w:t>The program asks for class and date, validates the student count, processes each student, and then displays the totals.</w:t>
       </w:r>
     </w:p>
     <w:p>
-      <w:pPr>
-        <w:pStyle w:val="ListBullet"/>
-      </w:pPr>
       <w:r>
         <w:rPr>
           <w:b/>
         </w:rPr>
-        <w:t xml:space="preserve">Selection (IF/ELSE): </w:t>
+        <w:t xml:space="preserve">Selection: </w:t>
       </w:r>
       <w:r>
-        <w:t>The system checks the teacher's login and uses IF/ELSE conditions to interpret attendance status and reject invalid choices.</w:t>
+        <w:t>IF / ELSE IF / ELSE assigns each valid status to the correct total.</w:t>
       </w:r>
     </w:p>
     <w:p>
-      <w:pPr>
-        <w:pStyle w:val="ListBullet"/>
-      </w:pPr>
       <w:r>
         <w:rPr>
           <w:b/>
         </w:rPr>
-        <w:t xml:space="preserve">Repetition (WHILE): </w:t>
+        <w:t xml:space="preserve">Repetition: </w:t>
       </w:r>
       <w:r>
-        <w:t>The WHILE loop repeats the attendance-entry steps while the teacher answers YES to having more students.</w:t>
+        <w:t>The first REPEAT loop rejects a non-positive student count. The second REPEAT loop rejects an invalid status. The WHILE loop processes every student.</w:t>
       </w:r>
     </w:p>
     <w:p>
-      <w:pPr>
-        <w:pStyle w:val="ListBullet"/>
-      </w:pPr>
       <w:r>
         <w:rPr>
           <w:b/>
         </w:rPr>
-        <w:t xml:space="preserve">Input: </w:t>
+        <w:t xml:space="preserve">Input and output: </w:t>
       </w:r>
       <w:r>
-        <w:t>The teacher enters login details, class, date, student details, attendance status, and report choice.</w:t>
+        <w:t>Inputs are the class, date, count, student names, and status codes. Outputs are the class details and attendance totals.</w:t>
       </w:r>
     </w:p>
     <w:p>
-      <w:pPr>
-        <w:pStyle w:val="ListBullet"/>
-      </w:pPr>
-      <w:r>
-        <w:rPr>
-          <w:b/>
-        </w:rPr>
-        <w:t xml:space="preserve">Output: </w:t>
-      </w:r>
-      <w:r>
-        <w:t>The system displays messages and, if requested, an attendance summary.</w:t>
-      </w:r>
-    </w:p>
-    <w:p>
-      <w:pPr>
-        <w:pStyle w:val="ListBullet"/>
-      </w:pPr>
       <w:r>
         <w:rPr>
           <w:b/>
@@ -270,7 +194,7 @@
         <w:t xml:space="preserve">Storage: </w:t>
       </w:r>
       <w:r>
-        <w:t>Each record is saved with the student's ID, name, class, date, and status.</w:t>
+        <w:t>The classroom prototype counts entries for the current run only. Persistent saving would require a database or another storage mechanism.</w:t>
       </w:r>
     </w:p>
     <w:p>
@@ -278,12 +202,12 @@
         <w:pStyle w:val="Heading1"/>
       </w:pPr>
       <w:r>
-        <w:t>4. Example Test Scenario</w:t>
+        <w:t>4. Example test scenario</w:t>
       </w:r>
     </w:p>
     <w:p>
       <w:r>
-        <w:t>If the teacher logs in successfully, selects Form 2 and enters the attendance date, the teacher can record one student as Present, another as Absent, and another as Late. After the teacher enters NO when asked whether there are more students, the system stops the loop. If the teacher requests a report, the system displays the totals for Present, Absent, and Late.</w:t>
+        <w:t>Enter class Form 2A, date 2026-10-14, and 3 students. Enter Ama / P, Binta / A, and Joseph / L. The expected result is 3 total students, 1 present, 1 absent, and 1 late. If X is entered as a status, the program should request a valid code before continuing.</w:t>
       </w:r>
     </w:p>
     <w:p>
@@ -296,12 +220,12 @@
     </w:p>
     <w:p>
       <w:r>
-        <w:t>This is pseudocode for the proposed system, not a working software program. Commands such as SAVE and CALCULATE describe operations that would need to be implemented in a programming language when the system is developed.</w:t>
+        <w:t>This is pseudocode for a proposed attendance process, accompanied by an editable Flowgorithm prototype. The prototype is for learning and testing with fictional data; it is not a deployed school system.</w:t>
       </w:r>
     </w:p>
     <w:sectPr>
       <w:pgSz w:w="12240" w:h="15840"/>
-      <w:pgMar w:top="1080" w:right="1224" w:bottom="1080" w:left="1224" w:header="720" w:footer="720" w:gutter="0"/>
+      <w:pgMar w:top="1008" w:right="1800" w:bottom="1008" w:left="1800" w:header="720" w:footer="720" w:gutter="0"/>
       <w:cols w:space="720"/>
       <w:docGrid w:linePitch="360"/>
     </w:sectPr>
@@ -672,13 +596,9 @@
     <w:name w:val="Normal"/>
     <w:qFormat/>
     <w:rsid w:val="00FC693F"/>
-    <w:pPr>
-      <w:spacing w:line="276" w:lineRule="auto"/>
-      <w:jc w:val="both"/>
-    </w:pPr>
     <w:rPr>
-      <w:rFonts w:ascii="Tahoma" w:hAnsi="Tahoma" w:eastAsia="Tahoma"/>
-      <w:sz w:val="20"/>
+      <w:rFonts w:ascii="Arial" w:hAnsi="Arial"/>
+      <w:sz w:val="21"/>
     </w:rPr>
   </w:style>
   <w:style w:type="paragraph" w:styleId="Header">
@@ -740,7 +660,7 @@
       <w:outlineLvl w:val="0"/>
     </w:pPr>
     <w:rPr>
-      <w:rFonts w:asciiTheme="majorHAnsi" w:eastAsiaTheme="majorEastAsia" w:hAnsiTheme="majorHAnsi" w:cstheme="majorBidi" w:ascii="Tahoma" w:hAnsi="Tahoma" w:eastAsia="Tahoma"/>
+      <w:rFonts w:asciiTheme="majorHAnsi" w:eastAsiaTheme="majorEastAsia" w:hAnsiTheme="majorHAnsi" w:cstheme="majorBidi" w:ascii="Arial" w:hAnsi="Arial"/>
       <w:b/>
       <w:bCs/>
       <w:color w:val="365F91" w:themeColor="accent1" w:themeShade="BF"/>
@@ -764,7 +684,7 @@
       <w:outlineLvl w:val="1"/>
     </w:pPr>
     <w:rPr>
-      <w:rFonts w:asciiTheme="majorHAnsi" w:eastAsiaTheme="majorEastAsia" w:hAnsiTheme="majorHAnsi" w:cstheme="majorBidi" w:ascii="Tahoma" w:hAnsi="Tahoma" w:eastAsia="Tahoma"/>
+      <w:rFonts w:asciiTheme="majorHAnsi" w:eastAsiaTheme="majorEastAsia" w:hAnsiTheme="majorHAnsi" w:cstheme="majorBidi"/>
       <w:b/>
       <w:bCs/>
       <w:color w:val="4F81BD" w:themeColor="accent1"/>
@@ -1029,11 +949,11 @@
       <w:contextualSpacing/>
     </w:pPr>
     <w:rPr>
-      <w:rFonts w:asciiTheme="majorHAnsi" w:eastAsiaTheme="majorEastAsia" w:hAnsiTheme="majorHAnsi" w:cstheme="majorBidi" w:ascii="Tahoma" w:hAnsi="Tahoma" w:eastAsia="Tahoma"/>
+      <w:rFonts w:asciiTheme="majorHAnsi" w:eastAsiaTheme="majorEastAsia" w:hAnsiTheme="majorHAnsi" w:cstheme="majorBidi" w:ascii="Arial" w:hAnsi="Arial"/>
       <w:color w:val="17365D" w:themeColor="text2" w:themeShade="BF"/>
       <w:spacing w:val="5"/>
       <w:kern w:val="28"/>
-      <w:sz w:val="52"/>
+      <w:sz w:val="40"/>
       <w:szCs w:val="52"/>
     </w:rPr>
   </w:style>

</xml_diff>